<commit_message>
Refresh two-page user manual
</commit_message>
<xml_diff>
--- a/docs/คู่มือใช้งาน.docx
+++ b/docs/คู่มือใช้งาน.docx
@@ -4,135 +4,109 @@
   <w:body>
     <w:p>
       <w:pPr>
-        <w:pStyle w:val="Title"/>
+        <w:spacing w:after="40"/>
       </w:pPr>
       <w:r>
-        <w:t>คู่มือใช้งาน ใบเสร็จดี</w:t>
-      </w:r>
-    </w:p>
-    <w:p>
-      <w:r>
-        <w:t>สำหรับผู้ใช้งานระบบที่ติดตั้งบน Raspberry Pi แล้ว · หน้า 1/2</w:t>
+        <w:rPr>
+          <w:rFonts w:ascii="Noto Sans Thai" w:hAnsi="Noto Sans Thai" w:eastAsia="Noto Sans Thai" w:cs="Noto Sans Thai"/>
+          <w:b/>
+          <w:color w:val="5C6864"/>
+          <w:sz w:val="17"/>
+        </w:rPr>
+        <w:t>คู่มือใช้งาน · หน้า 1/2</w:t>
       </w:r>
     </w:p>
     <w:p>
       <w:pPr>
-        <w:pStyle w:val="Heading1"/>
+        <w:spacing w:after="40"/>
       </w:pPr>
       <w:r>
-        <w:t>1. เปิดระบบและเชื่อมต่อ</w:t>
+        <w:rPr>
+          <w:rFonts w:ascii="Noto Sans Thai" w:hAnsi="Noto Sans Thai" w:eastAsia="Noto Sans Thai" w:cs="Noto Sans Thai"/>
+          <w:b/>
+          <w:color w:val="0A4A37"/>
+          <w:sz w:val="40"/>
+        </w:rPr>
+        <w:t>เริ่มต้นใช้งานและอัปโหลดใบเสร็จ</w:t>
       </w:r>
     </w:p>
     <w:p>
       <w:pPr>
-        <w:pStyle w:val="ListNumber"/>
+        <w:spacing w:after="160"/>
       </w:pPr>
       <w:r>
-        <w:t>เสียบไฟ Raspberry Pi และรอให้ระบบเริ่มทำงาน หากตั้งบริการอัตโนมัติแล้ว เว็บและ AI จะเริ่มเอง</w:t>
-      </w:r>
-    </w:p>
-    <w:p>
-      <w:pPr>
-        <w:pStyle w:val="ListNumber"/>
-      </w:pPr>
-      <w:r>
-        <w:t>เชื่อมมือถือเข้ากับ Wi-Fi เดียวกับ Pi เปิดเบราว์เซอร์แล้วพิมพ์ IP ของ Pi ตามด้วย :5000 เช่น http://192.168.1.50:5000 (เปลี่ยนเป็น IP เครื่องจริง)</w:t>
-      </w:r>
-    </w:p>
-    <w:p>
-      <w:pPr>
-        <w:pStyle w:val="ListNumber"/>
-      </w:pPr>
-      <w:r>
-        <w:t>ดูสถานะ OCR และ AI บนหน้าแรก รอให้พร้อมก่อนทดสอบ AI หาก AI ยังไม่พร้อม ระบบจะให้กรอกเองและไม่ถือว่า AI วิเคราะห์สำเร็จ</w:t>
-      </w:r>
-    </w:p>
-    <w:p>
-      <w:pPr>
-        <w:pStyle w:val="Heading1"/>
-      </w:pPr>
-      <w:r>
-        <w:t>2. ถ่ายภาพและอัปโหลดใบเสร็จ</w:t>
+        <w:rPr>
+          <w:rFonts w:ascii="Noto Sans Thai" w:hAnsi="Noto Sans Thai" w:eastAsia="Noto Sans Thai" w:cs="Noto Sans Thai"/>
+          <w:b w:val="0"/>
+          <w:color w:val="5C6864"/>
+          <w:sz w:val="20"/>
+        </w:rPr>
+        <w:t>ใช้งานจาก Raspberry Pi หรืออุปกรณ์ที่เชื่อมต่อ Wi-Fi เดียวกัน</w:t>
       </w:r>
     </w:p>
     <w:tbl>
       <w:tblPr>
         <w:tblW w:type="auto" w:w="0"/>
+        <w:jc w:val="center"/>
         <w:tblLayout w:type="fixed"/>
         <w:tblLook w:firstColumn="1" w:firstRow="1" w:lastColumn="0" w:lastRow="0" w:noHBand="0" w:noVBand="1" w:val="04A0"/>
       </w:tblPr>
       <w:tblGrid>
-        <w:gridCol w:w="4535"/>
-        <w:gridCol w:w="5102"/>
+        <w:gridCol w:w="680"/>
+        <w:gridCol w:w="9184"/>
       </w:tblGrid>
       <w:tr>
-        <w:trPr>
-          <w:cantSplit/>
-        </w:trPr>
         <w:tc>
           <w:tcPr>
-            <w:tcW w:type="dxa" w:w="5046"/>
+            <w:tcW w:type="dxa" w:w="5131"/>
+            <w:vAlign w:val="center"/>
+            <w:shd w:fill="0A4A37"/>
           </w:tcPr>
           <w:p>
+            <w:pPr>
+              <w:jc w:val="center"/>
+            </w:pPr>
             <w:r>
-              <w:drawing>
-                <wp:inline xmlns:a="http://schemas.openxmlformats.org/drawingml/2006/main" xmlns:pic="http://schemas.openxmlformats.org/drawingml/2006/picture">
-                  <wp:extent cx="2664000" cy="2697722"/>
-                  <wp:docPr id="1" name="Picture 1"/>
-                  <wp:cNvGraphicFramePr>
-                    <a:graphicFrameLocks noChangeAspect="1"/>
-                  </wp:cNvGraphicFramePr>
-                  <a:graphic>
-                    <a:graphicData uri="http://schemas.openxmlformats.org/drawingml/2006/picture">
-                      <pic:pic>
-                        <pic:nvPicPr>
-                          <pic:cNvPr id="0" name="05-upload-mobile.png"/>
-                          <pic:cNvPicPr/>
-                        </pic:nvPicPr>
-                        <pic:blipFill>
-                          <a:blip r:embed="rId10"/>
-                          <a:stretch>
-                            <a:fillRect/>
-                          </a:stretch>
-                        </pic:blipFill>
-                        <pic:spPr>
-                          <a:xfrm>
-                            <a:off x="0" y="0"/>
-                            <a:ext cx="2664000" cy="2697722"/>
-                          </a:xfrm>
-                          <a:prstGeom prst="rect"/>
-                        </pic:spPr>
-                      </pic:pic>
-                    </a:graphicData>
-                  </a:graphic>
-                </wp:inline>
-              </w:drawing>
+              <w:rPr>
+                <w:rFonts w:ascii="Noto Sans Thai" w:hAnsi="Noto Sans Thai" w:eastAsia="Noto Sans Thai" w:cs="Noto Sans Thai"/>
+                <w:b/>
+                <w:color w:val="FFFFFF"/>
+                <w:sz w:val="24"/>
+              </w:rPr>
+              <w:t>1</w:t>
             </w:r>
           </w:p>
         </w:tc>
         <w:tc>
           <w:tcPr>
-            <w:tcW w:type="dxa" w:w="5046"/>
+            <w:tcW w:type="dxa" w:w="5131"/>
           </w:tcPr>
-          <w:p/>
           <w:p>
+            <w:pPr>
+              <w:spacing w:after="20"/>
+            </w:pPr>
             <w:r>
-              <w:t>1. วางใบเสร็จให้เรียบ มีแสงพอ ไม่เอียง และเห็นรายการกับยอดรวมครบ</w:t>
+              <w:rPr>
+                <w:rFonts w:ascii="Noto Sans Thai" w:hAnsi="Noto Sans Thai" w:eastAsia="Noto Sans Thai" w:cs="Noto Sans Thai"/>
+                <w:b/>
+                <w:color w:val="0A4A37"/>
+                <w:sz w:val="21"/>
+              </w:rPr>
+              <w:t>เปิดระบบ</w:t>
             </w:r>
           </w:p>
           <w:p>
+            <w:pPr>
+              <w:spacing w:after="20"/>
+            </w:pPr>
             <w:r>
-              <w:t>2. แตะ “เลือกรูปใบเสร็จของคุณ” แล้วเลือกรูป JPG หรือ PNG ขนาดไม่เกิน 10 MB / 20 ล้านพิกเซล</w:t>
-            </w:r>
-          </w:p>
-          <w:p>
-            <w:r>
-              <w:t>3. กด “เริ่มอ่านใบเสร็จ” แล้วรอ หน้าจอจะบอกว่ากำลังวิเคราะห์ บน Pi อาจใช้เวลาหลายนาที</w:t>
-            </w:r>
-          </w:p>
-          <w:p>
-            <w:r>
-              <w:t>4. หากออกจากหน้าเว็บ กลับไปหน้าอัปโหลดและเปิดรายการจาก “รายการที่รอตรวจ”</w:t>
+              <w:rPr>
+                <w:rFonts w:ascii="Noto Sans Thai" w:hAnsi="Noto Sans Thai" w:eastAsia="Noto Sans Thai" w:cs="Noto Sans Thai"/>
+                <w:b w:val="0"/>
+                <w:color w:val="5C6864"/>
+                <w:sz w:val="18"/>
+              </w:rPr>
+              <w:t>เปิด Local AI ด้วย scripts/start_llm.sh และเปิดเว็บไซต์ด้วย scripts/start_web.sh จากโฟลเดอร์ ProjectIOT</w:t>
             </w:r>
           </w:p>
         </w:tc>
@@ -140,25 +114,248 @@
     </w:tbl>
     <w:p>
       <w:pPr>
-        <w:pStyle w:val="Caption"/>
+        <w:spacing w:after="0"/>
+      </w:pPr>
+    </w:p>
+    <w:tbl>
+      <w:tblPr>
+        <w:tblW w:type="auto" w:w="0"/>
+        <w:jc w:val="center"/>
+        <w:tblLayout w:type="fixed"/>
+        <w:tblLook w:firstColumn="1" w:firstRow="1" w:lastColumn="0" w:lastRow="0" w:noHBand="0" w:noVBand="1" w:val="04A0"/>
+      </w:tblPr>
+      <w:tblGrid>
+        <w:gridCol w:w="680"/>
+        <w:gridCol w:w="9184"/>
+      </w:tblGrid>
+      <w:tr>
+        <w:tc>
+          <w:tcPr>
+            <w:tcW w:type="dxa" w:w="5131"/>
+            <w:vAlign w:val="center"/>
+            <w:shd w:fill="0A4A37"/>
+          </w:tcPr>
+          <w:p>
+            <w:pPr>
+              <w:jc w:val="center"/>
+            </w:pPr>
+            <w:r>
+              <w:rPr>
+                <w:rFonts w:ascii="Noto Sans Thai" w:hAnsi="Noto Sans Thai" w:eastAsia="Noto Sans Thai" w:cs="Noto Sans Thai"/>
+                <w:b/>
+                <w:color w:val="FFFFFF"/>
+                <w:sz w:val="24"/>
+              </w:rPr>
+              <w:t>2</w:t>
+            </w:r>
+          </w:p>
+        </w:tc>
+        <w:tc>
+          <w:tcPr>
+            <w:tcW w:type="dxa" w:w="5131"/>
+          </w:tcPr>
+          <w:p>
+            <w:pPr>
+              <w:spacing w:after="20"/>
+            </w:pPr>
+            <w:r>
+              <w:rPr>
+                <w:rFonts w:ascii="Noto Sans Thai" w:hAnsi="Noto Sans Thai" w:eastAsia="Noto Sans Thai" w:cs="Noto Sans Thai"/>
+                <w:b/>
+                <w:color w:val="0A4A37"/>
+                <w:sz w:val="21"/>
+              </w:rPr>
+              <w:t>เข้าเว็บไซต์</w:t>
+            </w:r>
+          </w:p>
+          <w:p>
+            <w:pPr>
+              <w:spacing w:after="20"/>
+            </w:pPr>
+            <w:r>
+              <w:rPr>
+                <w:rFonts w:ascii="Noto Sans Thai" w:hAnsi="Noto Sans Thai" w:eastAsia="Noto Sans Thai" w:cs="Noto Sans Thai"/>
+                <w:b w:val="0"/>
+                <w:color w:val="5C6864"/>
+                <w:sz w:val="18"/>
+              </w:rPr>
+              <w:t>บน Pi เปิด http://127.0.0.1:5000 หรือจากเครื่องอื่นเปิด http://&lt;IP ของ Pi&gt;:5000</w:t>
+            </w:r>
+          </w:p>
+        </w:tc>
+      </w:tr>
+    </w:tbl>
+    <w:p>
+      <w:pPr>
+        <w:spacing w:after="0"/>
+      </w:pPr>
+    </w:p>
+    <w:tbl>
+      <w:tblPr>
+        <w:tblW w:type="auto" w:w="0"/>
+        <w:jc w:val="center"/>
+        <w:tblLayout w:type="fixed"/>
+        <w:tblLook w:firstColumn="1" w:firstRow="1" w:lastColumn="0" w:lastRow="0" w:noHBand="0" w:noVBand="1" w:val="04A0"/>
+      </w:tblPr>
+      <w:tblGrid>
+        <w:gridCol w:w="680"/>
+        <w:gridCol w:w="9184"/>
+      </w:tblGrid>
+      <w:tr>
+        <w:tc>
+          <w:tcPr>
+            <w:tcW w:type="dxa" w:w="5131"/>
+            <w:vAlign w:val="center"/>
+            <w:shd w:fill="0A4A37"/>
+          </w:tcPr>
+          <w:p>
+            <w:pPr>
+              <w:jc w:val="center"/>
+            </w:pPr>
+            <w:r>
+              <w:rPr>
+                <w:rFonts w:ascii="Noto Sans Thai" w:hAnsi="Noto Sans Thai" w:eastAsia="Noto Sans Thai" w:cs="Noto Sans Thai"/>
+                <w:b/>
+                <w:color w:val="FFFFFF"/>
+                <w:sz w:val="24"/>
+              </w:rPr>
+              <w:t>3</w:t>
+            </w:r>
+          </w:p>
+        </w:tc>
+        <w:tc>
+          <w:tcPr>
+            <w:tcW w:type="dxa" w:w="5131"/>
+          </w:tcPr>
+          <w:p>
+            <w:pPr>
+              <w:spacing w:after="20"/>
+            </w:pPr>
+            <w:r>
+              <w:rPr>
+                <w:rFonts w:ascii="Noto Sans Thai" w:hAnsi="Noto Sans Thai" w:eastAsia="Noto Sans Thai" w:cs="Noto Sans Thai"/>
+                <w:b/>
+                <w:color w:val="0A4A37"/>
+                <w:sz w:val="21"/>
+              </w:rPr>
+              <w:t>เลือกภาพใบเสร็จ</w:t>
+            </w:r>
+          </w:p>
+          <w:p>
+            <w:pPr>
+              <w:spacing w:after="20"/>
+            </w:pPr>
+            <w:r>
+              <w:rPr>
+                <w:rFonts w:ascii="Noto Sans Thai" w:hAnsi="Noto Sans Thai" w:eastAsia="Noto Sans Thai" w:cs="Noto Sans Thai"/>
+                <w:b w:val="0"/>
+                <w:color w:val="5C6864"/>
+                <w:sz w:val="18"/>
+              </w:rPr>
+              <w:t>กด “เลือกรูปใบเสร็จของคุณ” เลือกไฟล์ JPG/PNG ที่เห็นรายการและยอดรวมครบ แล้วกด “เริ่มอ่านใบเสร็จ”</w:t>
+            </w:r>
+          </w:p>
+        </w:tc>
+      </w:tr>
+    </w:tbl>
+    <w:p>
+      <w:pPr>
+        <w:spacing w:after="0"/>
+      </w:pPr>
+    </w:p>
+    <w:p>
+      <w:pPr>
+        <w:spacing w:before="80"/>
+        <w:jc w:val="center"/>
       </w:pPr>
       <w:r>
-        <w:t>ภาพที่ 1 หน้าอัปโหลดจริงบนหน้าจอมือถือ (ข้อมูลสาธิต)</w:t>
+        <w:drawing>
+          <wp:inline xmlns:a="http://schemas.openxmlformats.org/drawingml/2006/main" xmlns:pic="http://schemas.openxmlformats.org/drawingml/2006/picture">
+            <wp:extent cx="6083999" cy="4478499"/>
+            <wp:docPr id="1" name="Picture 1"/>
+            <wp:cNvGraphicFramePr>
+              <a:graphicFrameLocks noChangeAspect="1"/>
+            </wp:cNvGraphicFramePr>
+            <a:graphic>
+              <a:graphicData uri="http://schemas.openxmlformats.org/drawingml/2006/picture">
+                <pic:pic>
+                  <pic:nvPicPr>
+                    <pic:cNvPr id="0" name="01-upload.png"/>
+                    <pic:cNvPicPr/>
+                  </pic:nvPicPr>
+                  <pic:blipFill>
+                    <a:blip r:embed="rId10"/>
+                    <a:stretch>
+                      <a:fillRect/>
+                    </a:stretch>
+                  </pic:blipFill>
+                  <pic:spPr>
+                    <a:xfrm>
+                      <a:off x="0" y="0"/>
+                      <a:ext cx="6083999" cy="4478499"/>
+                    </a:xfrm>
+                    <a:prstGeom prst="rect"/>
+                  </pic:spPr>
+                </pic:pic>
+              </a:graphicData>
+            </a:graphic>
+          </wp:inline>
+        </w:drawing>
       </w:r>
     </w:p>
     <w:p>
       <w:pPr>
-        <w:pStyle w:val="Heading2"/>
+        <w:spacing w:after="80"/>
+        <w:jc w:val="center"/>
       </w:pPr>
       <w:r>
-        <w:t>ก่อนเริ่มครั้งแรก</w:t>
+        <w:rPr>
+          <w:rFonts w:ascii="Noto Sans Thai" w:hAnsi="Noto Sans Thai" w:eastAsia="Noto Sans Thai" w:cs="Noto Sans Thai"/>
+          <w:b w:val="0"/>
+          <w:color w:val="5C6864"/>
+          <w:sz w:val="17"/>
+        </w:rPr>
+        <w:t>ภาพที่ 1 หน้าอัปโหลด — เลือกภาพที่ตรง ไม่เบลอ และไม่มีแสงสะท้อน</w:t>
       </w:r>
     </w:p>
-    <w:p>
-      <w:r>
-        <w:t>ผู้ติดตั้งทำตาม README.md: รัน setup_pi.sh เปิด start_llm.sh และ start_web.sh ทดสอบก่อนติดตั้งบริการอัตโนมัติด้วย install_services.sh ระบบใช้ LAN ภายใน ไม่มีบัญชีผู้ใช้</w:t>
-      </w:r>
-    </w:p>
+    <w:tbl>
+      <w:tblPr>
+        <w:tblW w:type="auto" w:w="0"/>
+        <w:jc w:val="center"/>
+        <w:tblLook w:firstColumn="1" w:firstRow="1" w:lastColumn="0" w:lastRow="0" w:noHBand="0" w:noVBand="1" w:val="04A0"/>
+      </w:tblPr>
+      <w:tblGrid>
+        <w:gridCol w:w="10262"/>
+      </w:tblGrid>
+      <w:tr>
+        <w:tc>
+          <w:tcPr>
+            <w:tcW w:type="dxa" w:w="10262"/>
+            <w:shd w:fill="F8F5EC"/>
+          </w:tcPr>
+          <w:p>
+            <w:r>
+              <w:rPr>
+                <w:rFonts w:ascii="Noto Sans Thai" w:hAnsi="Noto Sans Thai" w:eastAsia="Noto Sans Thai" w:cs="Noto Sans Thai"/>
+                <w:b/>
+                <w:color w:val="0A4A37"/>
+                <w:sz w:val="19"/>
+              </w:rPr>
+              <w:t>ระหว่างประมวลผล</w:t>
+            </w:r>
+            <w:r>
+              <w:rPr>
+                <w:rFonts w:ascii="Noto Sans Thai" w:hAnsi="Noto Sans Thai" w:eastAsia="Noto Sans Thai" w:cs="Noto Sans Thai"/>
+                <w:b w:val="0"/>
+                <w:color w:val="202926"/>
+                <w:sz w:val="18"/>
+              </w:rPr>
+              <w:t xml:space="preserve"> ระบบจะปรับภาพ อ่าน OCR และวิเคราะห์ด้วย Local AI บน Raspberry Pi อาจใช้เวลาหลายวินาทีถึงหลายนาที ห้ามปิด terminal ของ AI และเว็บ</w:t>
+            </w:r>
+          </w:p>
+        </w:tc>
+      </w:tr>
+    </w:tbl>
     <w:p>
       <w:r>
         <w:br w:type="page"/>
@@ -166,58 +363,71 @@
     </w:p>
     <w:p>
       <w:pPr>
-        <w:pStyle w:val="Title"/>
+        <w:spacing w:after="40"/>
       </w:pPr>
       <w:r>
-        <w:t>ตรวจแก้ บันทึก และดูรายจ่าย</w:t>
-      </w:r>
-    </w:p>
-    <w:p>
-      <w:r>
-        <w:t>คู่มือใช้งาน ใบเสร็จดี · หน้า 2/2</w:t>
+        <w:rPr>
+          <w:rFonts w:ascii="Noto Sans Thai" w:hAnsi="Noto Sans Thai" w:eastAsia="Noto Sans Thai" w:cs="Noto Sans Thai"/>
+          <w:b/>
+          <w:color w:val="5C6864"/>
+          <w:sz w:val="17"/>
+        </w:rPr>
+        <w:t>คู่มือใช้งาน · หน้า 2/2</w:t>
       </w:r>
     </w:p>
     <w:p>
       <w:pPr>
-        <w:pStyle w:val="Heading1"/>
+        <w:spacing w:after="40"/>
       </w:pPr>
       <w:r>
-        <w:t>3. ตรวจข้อมูลก่อนยืนยัน</w:t>
+        <w:rPr>
+          <w:rFonts w:ascii="Noto Sans Thai" w:hAnsi="Noto Sans Thai" w:eastAsia="Noto Sans Thai" w:cs="Noto Sans Thai"/>
+          <w:b/>
+          <w:color w:val="0A4A37"/>
+          <w:sz w:val="40"/>
+        </w:rPr>
+        <w:t>ตรวจแก้ ยืนยัน และดู Dashboard</w:t>
       </w:r>
     </w:p>
     <w:p>
+      <w:pPr>
+        <w:spacing w:after="160"/>
+      </w:pPr>
       <w:r>
-        <w:t>เทียบภาพกับชื่อร้าน วันที่ (ปี ค.ศ.) ชื่อสินค้า จำนวน ยอดรวมบรรทัด และหมวดหมู่ แก้ไขทุกช่องที่ผิด เพิ่มหรือลบสินค้าได้ ยอดบรรทัดคือราคาทั้งบรรทัด ไม่ต้องคูณจำนวนซ้ำ</w:t>
-      </w:r>
-    </w:p>
-    <w:p>
-      <w:r>
-        <w:t>ส่วนลดใส่ค่าลบ เช่น -10.00 และระบุเหตุผล ตรวจยอดรวมบนใบเสร็จ หากยอดต่าง ให้แก้หรือเลือกยืนยันส่วนต่างหลังตรวจจริง จากนั้นกด “ยืนยันและบันทึกค่าใช้จ่าย”</w:t>
+        <w:rPr>
+          <w:rFonts w:ascii="Noto Sans Thai" w:hAnsi="Noto Sans Thai" w:eastAsia="Noto Sans Thai" w:cs="Noto Sans Thai"/>
+          <w:b w:val="0"/>
+          <w:color w:val="5C6864"/>
+          <w:sz w:val="20"/>
+        </w:rPr>
+        <w:t>ข้อมูลจาก AI เป็นร่าง ผู้ใช้ต้องเทียบกับภาพต้นฉบับก่อนบันทึกทุกครั้ง</w:t>
       </w:r>
     </w:p>
     <w:tbl>
       <w:tblPr>
         <w:tblW w:type="auto" w:w="0"/>
+        <w:jc w:val="center"/>
         <w:tblLayout w:type="fixed"/>
         <w:tblLook w:firstColumn="1" w:firstRow="1" w:lastColumn="0" w:lastRow="0" w:noHBand="0" w:noVBand="1" w:val="04A0"/>
       </w:tblPr>
       <w:tblGrid>
-        <w:gridCol w:w="4876"/>
-        <w:gridCol w:w="4876"/>
+        <w:gridCol w:w="4932"/>
+        <w:gridCol w:w="5102"/>
       </w:tblGrid>
       <w:tr>
-        <w:trPr>
-          <w:cantSplit/>
-        </w:trPr>
         <w:tc>
           <w:tcPr>
-            <w:tcW w:type="dxa" w:w="5046"/>
+            <w:tcW w:type="dxa" w:w="5131"/>
+            <w:vAlign w:val="top"/>
           </w:tcPr>
           <w:p>
+            <w:pPr>
+              <w:jc w:val="center"/>
+            </w:pPr>
             <w:r>
               <w:drawing>
                 <wp:inline xmlns:a="http://schemas.openxmlformats.org/drawingml/2006/main" xmlns:pic="http://schemas.openxmlformats.org/drawingml/2006/picture">
-                  <wp:extent cx="2196000" cy="4752369"/>
+                  <wp:extent cx="2772000" cy="2839375"/>
                   <wp:docPr id="2" name="Picture 2"/>
                   <wp:cNvGraphicFramePr>
                     <a:graphicFrameLocks noChangeAspect="1"/>
@@ -226,7 +436,7 @@
                     <a:graphicData uri="http://schemas.openxmlformats.org/drawingml/2006/picture">
                       <pic:pic>
                         <pic:nvPicPr>
-                          <pic:cNvPr id="0" name="06-review-mobile.png"/>
+                          <pic:cNvPr id="0" name="02-review.png"/>
                           <pic:cNvPicPr/>
                         </pic:nvPicPr>
                         <pic:blipFill>
@@ -238,7 +448,7 @@
                         <pic:spPr>
                           <a:xfrm>
                             <a:off x="0" y="0"/>
-                            <a:ext cx="2196000" cy="4752369"/>
+                            <a:ext cx="2772000" cy="2839375"/>
                           </a:xfrm>
                           <a:prstGeom prst="rect"/>
                         </pic:spPr>
@@ -251,22 +461,231 @@
           </w:p>
           <w:p>
             <w:pPr>
-              <w:pStyle w:val="Caption"/>
+              <w:jc w:val="center"/>
             </w:pPr>
             <w:r>
-              <w:t>ภาพที่ 2 ตรวจยอดและยืนยัน</w:t>
+              <w:rPr>
+                <w:rFonts w:ascii="Noto Sans Thai" w:hAnsi="Noto Sans Thai" w:eastAsia="Noto Sans Thai" w:cs="Noto Sans Thai"/>
+                <w:b w:val="0"/>
+                <w:color w:val="5C6864"/>
+                <w:sz w:val="17"/>
+              </w:rPr>
+              <w:t>ภาพที่ 2 หน้าตรวจแก้ข้อมูล</w:t>
             </w:r>
           </w:p>
         </w:tc>
         <w:tc>
           <w:tcPr>
-            <w:tcW w:type="dxa" w:w="5046"/>
+            <w:tcW w:type="dxa" w:w="5131"/>
+            <w:vAlign w:val="top"/>
           </w:tcPr>
+          <w:p/>
+          <w:tbl>
+            <w:tblPr>
+              <w:tblW w:type="auto" w:w="0"/>
+              <w:tblLayout w:type="fixed"/>
+              <w:tblLook w:firstColumn="1" w:firstRow="1" w:lastColumn="0" w:lastRow="0" w:noHBand="0" w:noVBand="1" w:val="04A0"/>
+            </w:tblPr>
+            <w:tblGrid>
+              <w:gridCol w:w="567"/>
+              <w:gridCol w:w="4309"/>
+            </w:tblGrid>
+            <w:tr>
+              <w:tc>
+                <w:tcPr>
+                  <w:tcW w:type="dxa" w:w="2565"/>
+                  <w:shd w:fill="0A4A37"/>
+                </w:tcPr>
+                <w:p>
+                  <w:pPr>
+                    <w:jc w:val="center"/>
+                  </w:pPr>
+                  <w:r>
+                    <w:rPr>
+                      <w:rFonts w:ascii="Noto Sans Thai" w:hAnsi="Noto Sans Thai" w:eastAsia="Noto Sans Thai" w:cs="Noto Sans Thai"/>
+                      <w:b/>
+                      <w:color w:val="FFFFFF"/>
+                      <w:sz w:val="22"/>
+                    </w:rPr>
+                    <w:t>4</w:t>
+                  </w:r>
+                </w:p>
+              </w:tc>
+              <w:tc>
+                <w:tcPr>
+                  <w:tcW w:type="dxa" w:w="2565"/>
+                </w:tcPr>
+                <w:p>
+                  <w:r>
+                    <w:rPr>
+                      <w:rFonts w:ascii="Noto Sans Thai" w:hAnsi="Noto Sans Thai" w:eastAsia="Noto Sans Thai" w:cs="Noto Sans Thai"/>
+                      <w:b/>
+                      <w:color w:val="0A4A37"/>
+                      <w:sz w:val="20"/>
+                    </w:rPr>
+                    <w:t>ตรวจข้อมูล</w:t>
+                  </w:r>
+                </w:p>
+                <w:p>
+                  <w:r>
+                    <w:rPr>
+                      <w:rFonts w:ascii="Noto Sans Thai" w:hAnsi="Noto Sans Thai" w:eastAsia="Noto Sans Thai" w:cs="Noto Sans Thai"/>
+                      <w:b w:val="0"/>
+                      <w:color w:val="5C6864"/>
+                      <w:sz w:val="17"/>
+                    </w:rPr>
+                    <w:t>ตรวจชื่อร้าน/ลูกค้า วันที่ ชื่อสินค้า จำนวน และยอดรวมบรรทัด แก้ไขช่องที่ผิดได้ทันที</w:t>
+                  </w:r>
+                </w:p>
+              </w:tc>
+            </w:tr>
+          </w:tbl>
+          <w:p/>
           <w:p>
+            <w:pPr>
+              <w:spacing w:after="20"/>
+            </w:pPr>
+          </w:p>
+          <w:tbl>
+            <w:tblPr>
+              <w:tblW w:type="auto" w:w="0"/>
+              <w:tblLayout w:type="fixed"/>
+              <w:tblLook w:firstColumn="1" w:firstRow="1" w:lastColumn="0" w:lastRow="0" w:noHBand="0" w:noVBand="1" w:val="04A0"/>
+            </w:tblPr>
+            <w:tblGrid>
+              <w:gridCol w:w="567"/>
+              <w:gridCol w:w="4309"/>
+            </w:tblGrid>
+            <w:tr>
+              <w:tc>
+                <w:tcPr>
+                  <w:tcW w:type="dxa" w:w="2565"/>
+                  <w:shd w:fill="0A4A37"/>
+                </w:tcPr>
+                <w:p>
+                  <w:pPr>
+                    <w:jc w:val="center"/>
+                  </w:pPr>
+                  <w:r>
+                    <w:rPr>
+                      <w:rFonts w:ascii="Noto Sans Thai" w:hAnsi="Noto Sans Thai" w:eastAsia="Noto Sans Thai" w:cs="Noto Sans Thai"/>
+                      <w:b/>
+                      <w:color w:val="FFFFFF"/>
+                      <w:sz w:val="22"/>
+                    </w:rPr>
+                    <w:t>5</w:t>
+                  </w:r>
+                </w:p>
+              </w:tc>
+              <w:tc>
+                <w:tcPr>
+                  <w:tcW w:type="dxa" w:w="2565"/>
+                </w:tcPr>
+                <w:p>
+                  <w:r>
+                    <w:rPr>
+                      <w:rFonts w:ascii="Noto Sans Thai" w:hAnsi="Noto Sans Thai" w:eastAsia="Noto Sans Thai" w:cs="Noto Sans Thai"/>
+                      <w:b/>
+                      <w:color w:val="0A4A37"/>
+                      <w:sz w:val="20"/>
+                    </w:rPr>
+                    <w:t>กรอกหมวดหมู่และส่วนลด</w:t>
+                  </w:r>
+                </w:p>
+                <w:p>
+                  <w:r>
+                    <w:rPr>
+                      <w:rFonts w:ascii="Noto Sans Thai" w:hAnsi="Noto Sans Thai" w:eastAsia="Noto Sans Thai" w:cs="Noto Sans Thai"/>
+                      <w:b w:val="0"/>
+                      <w:color w:val="5C6864"/>
+                      <w:sz w:val="17"/>
+                    </w:rPr>
+                    <w:t>พิมพ์หมวดหมู่เอง หากลด 6 บาทให้กรอก 6.00 ระบบจะนำไปลบจากยอดสินค้า</w:t>
+                  </w:r>
+                </w:p>
+              </w:tc>
+            </w:tr>
+          </w:tbl>
+          <w:p/>
+          <w:p>
+            <w:pPr>
+              <w:spacing w:after="20"/>
+            </w:pPr>
+          </w:p>
+          <w:tbl>
+            <w:tblPr>
+              <w:tblW w:type="auto" w:w="0"/>
+              <w:tblLayout w:type="fixed"/>
+              <w:tblLook w:firstColumn="1" w:firstRow="1" w:lastColumn="0" w:lastRow="0" w:noHBand="0" w:noVBand="1" w:val="04A0"/>
+            </w:tblPr>
+            <w:tblGrid>
+              <w:gridCol w:w="567"/>
+              <w:gridCol w:w="4309"/>
+            </w:tblGrid>
+            <w:tr>
+              <w:tc>
+                <w:tcPr>
+                  <w:tcW w:type="dxa" w:w="2565"/>
+                  <w:shd w:fill="0A4A37"/>
+                </w:tcPr>
+                <w:p>
+                  <w:pPr>
+                    <w:jc w:val="center"/>
+                  </w:pPr>
+                  <w:r>
+                    <w:rPr>
+                      <w:rFonts w:ascii="Noto Sans Thai" w:hAnsi="Noto Sans Thai" w:eastAsia="Noto Sans Thai" w:cs="Noto Sans Thai"/>
+                      <w:b/>
+                      <w:color w:val="FFFFFF"/>
+                      <w:sz w:val="22"/>
+                    </w:rPr>
+                    <w:t>6</w:t>
+                  </w:r>
+                </w:p>
+              </w:tc>
+              <w:tc>
+                <w:tcPr>
+                  <w:tcW w:type="dxa" w:w="2565"/>
+                </w:tcPr>
+                <w:p>
+                  <w:r>
+                    <w:rPr>
+                      <w:rFonts w:ascii="Noto Sans Thai" w:hAnsi="Noto Sans Thai" w:eastAsia="Noto Sans Thai" w:cs="Noto Sans Thai"/>
+                      <w:b/>
+                      <w:color w:val="0A4A37"/>
+                      <w:sz w:val="20"/>
+                    </w:rPr>
+                    <w:t>ยืนยันและบันทึก</w:t>
+                  </w:r>
+                </w:p>
+                <w:p>
+                  <w:r>
+                    <w:rPr>
+                      <w:rFonts w:ascii="Noto Sans Thai" w:hAnsi="Noto Sans Thai" w:eastAsia="Noto Sans Thai" w:cs="Noto Sans Thai"/>
+                      <w:b w:val="0"/>
+                      <w:color w:val="5C6864"/>
+                      <w:sz w:val="17"/>
+                    </w:rPr>
+                    <w:t>ตรวจยอดสุทธิให้ตรงใบเสร็จ แล้วกด “ยืนยันและบันทึกค่าใช้จ่าย”</w:t>
+                  </w:r>
+                </w:p>
+              </w:tc>
+            </w:tr>
+          </w:tbl>
+          <w:p/>
+          <w:p>
+            <w:pPr>
+              <w:spacing w:after="20"/>
+            </w:pPr>
+          </w:p>
+          <w:p>
+            <w:pPr>
+              <w:jc w:val="center"/>
+            </w:pPr>
             <w:r>
               <w:drawing>
                 <wp:inline xmlns:a="http://schemas.openxmlformats.org/drawingml/2006/main" xmlns:pic="http://schemas.openxmlformats.org/drawingml/2006/picture">
-                  <wp:extent cx="2196000" cy="4752369"/>
+                  <wp:extent cx="2916000" cy="2146500"/>
                   <wp:docPr id="3" name="Picture 3"/>
                   <wp:cNvGraphicFramePr>
                     <a:graphicFrameLocks noChangeAspect="1"/>
@@ -275,7 +694,7 @@
                     <a:graphicData uri="http://schemas.openxmlformats.org/drawingml/2006/picture">
                       <pic:pic>
                         <pic:nvPicPr>
-                          <pic:cNvPr id="0" name="07-dashboard-mobile.png"/>
+                          <pic:cNvPr id="0" name="03-dashboard.png"/>
                           <pic:cNvPicPr/>
                         </pic:nvPicPr>
                         <pic:blipFill>
@@ -287,7 +706,7 @@
                         <pic:spPr>
                           <a:xfrm>
                             <a:off x="0" y="0"/>
-                            <a:ext cx="2196000" cy="4752369"/>
+                            <a:ext cx="2916000" cy="2146500"/>
                           </a:xfrm>
                           <a:prstGeom prst="rect"/>
                         </pic:spPr>
@@ -300,37 +719,62 @@
           </w:p>
           <w:p>
             <w:pPr>
-              <w:pStyle w:val="Caption"/>
+              <w:jc w:val="center"/>
             </w:pPr>
             <w:r>
-              <w:t>ภาพที่ 3 ภาพรวมรายจ่าย</w:t>
+              <w:rPr>
+                <w:rFonts w:ascii="Noto Sans Thai" w:hAnsi="Noto Sans Thai" w:eastAsia="Noto Sans Thai" w:cs="Noto Sans Thai"/>
+                <w:b w:val="0"/>
+                <w:color w:val="5C6864"/>
+                <w:sz w:val="16"/>
+              </w:rPr>
+              <w:t>ภาพที่ 3 Dashboard แสดงยอดรวม หมวดหมู่ และประวัติ</w:t>
             </w:r>
           </w:p>
         </w:tc>
       </w:tr>
     </w:tbl>
-    <w:p>
-      <w:pPr>
-        <w:pStyle w:val="Heading1"/>
-      </w:pPr>
-      <w:r>
-        <w:t>4. ดู Dashboard และแก้ปัญหาเบื้องต้น</w:t>
-      </w:r>
-    </w:p>
-    <w:p>
-      <w:r>
-        <w:t>เปิด “ภาพรวมรายจ่าย” เลือกเดือนเพื่อดูยอดรวม หมวดหมู่ และประวัติ แตะชื่อร้านเพื่อดูรายละเอียด ใบที่ยังไม่ยืนยันจะไม่ถูกนับ</w:t>
-      </w:r>
-    </w:p>
-    <w:p>
-      <w:r>
-        <w:t>อ่านผิด: ถ่ายใหม่หรือกรอกเอง • เข้าเว็บไม่ได้: ตรวจ Wi-Fi, IP และไฟ Pi • AI ไม่พร้อม: ให้ผู้ติดตั้งตรวจบริการ • ก่อนถอดไฟให้สั่งปิดเครื่องอย่างถูกต้อง ข้อมูลเก็บบน Pi ควรสำรองตาม README</w:t>
-      </w:r>
-    </w:p>
+    <w:tbl>
+      <w:tblPr>
+        <w:tblW w:type="auto" w:w="0"/>
+        <w:tblLook w:firstColumn="1" w:firstRow="1" w:lastColumn="0" w:lastRow="0" w:noHBand="0" w:noVBand="1" w:val="04A0"/>
+      </w:tblPr>
+      <w:tblGrid>
+        <w:gridCol w:w="10262"/>
+      </w:tblGrid>
+      <w:tr>
+        <w:tc>
+          <w:tcPr>
+            <w:tcW w:type="dxa" w:w="10262"/>
+            <w:shd w:fill="EDF5EF"/>
+          </w:tcPr>
+          <w:p>
+            <w:r>
+              <w:rPr>
+                <w:rFonts w:ascii="Noto Sans Thai" w:hAnsi="Noto Sans Thai" w:eastAsia="Noto Sans Thai" w:cs="Noto Sans Thai"/>
+                <w:b/>
+                <w:color w:val="0A4A37"/>
+                <w:sz w:val="18"/>
+              </w:rPr>
+              <w:t xml:space="preserve">ข้อควรจำ: </w:t>
+            </w:r>
+            <w:r>
+              <w:rPr>
+                <w:rFonts w:ascii="Noto Sans Thai" w:hAnsi="Noto Sans Thai" w:eastAsia="Noto Sans Thai" w:cs="Noto Sans Thai"/>
+                <w:b w:val="0"/>
+                <w:color w:val="202926"/>
+                <w:sz w:val="18"/>
+              </w:rPr>
+              <w:t>ยอดบรรทัดคือยอดรวมของสินค้านั้นแล้ว ไม่ต้องคูณจำนวนซ้ำ • หาก AI อ่านผิดให้แก้เองก่อนบันทึก • Dashboard นับเฉพาะใบเสร็จที่ยืนยันแล้ว</w:t>
+            </w:r>
+          </w:p>
+        </w:tc>
+      </w:tr>
+    </w:tbl>
     <w:sectPr>
       <w:footerReference w:type="default" r:id="rId9"/>
       <w:pgSz w:w="11906" w:h="16838"/>
-      <w:pgMar w:top="850" w:right="907" w:bottom="850" w:left="907" w:header="720" w:footer="720" w:gutter="0"/>
+      <w:pgMar w:top="709" w:right="822" w:bottom="652" w:left="822" w:header="720" w:footer="720" w:gutter="0"/>
       <w:cols w:space="720"/>
       <w:docGrid w:linePitch="360"/>
     </w:sectPr>
@@ -343,14 +787,17 @@
   <w:p>
     <w:pPr>
       <w:pStyle w:val="Footer"/>
+      <w:jc w:val="center"/>
     </w:pPr>
     <w:r>
       <w:rPr>
+        <w:rFonts w:ascii="Noto Sans Thai" w:hAnsi="Noto Sans Thai" w:eastAsia="Noto Sans Thai" w:cs="Noto Sans Thai"/>
+        <w:b w:val="0"/>
+        <w:color w:val="5C6864"/>
         <w:sz w:val="16"/>
       </w:rPr>
-      <w:t xml:space="preserve">ใบเสร็จดี · Offline AI Receipt Analyzer   |   </w:t>
+      <w:t>ใบเสร็จดี · คู่มือใช้งานระบบ Offline AI Receipt Analyzer</w:t>
     </w:r>
-    <w:fldSimple w:instr="PAGE"/>
   </w:p>
 </w:ftr>
 </file>
@@ -718,14 +1165,6 @@
     <w:name w:val="Normal"/>
     <w:qFormat/>
     <w:rsid w:val="00FC693F"/>
-    <w:pPr>
-      <w:spacing w:after="100" w:line="276" w:lineRule="auto"/>
-    </w:pPr>
-    <w:rPr>
-      <w:rFonts w:ascii="Noto Sans Thai" w:hAnsi="Noto Sans Thai" w:eastAsia="Noto Sans Thai" w:cs="Noto Sans Thai"/>
-      <w:color w:val="173D36"/>
-      <w:sz w:val="20"/>
-    </w:rPr>
   </w:style>
   <w:style w:type="paragraph" w:styleId="Header">
     <w:name w:val="header"/>
@@ -782,15 +1221,15 @@
     <w:pPr>
       <w:keepNext/>
       <w:keepLines/>
-      <w:spacing w:before="480" w:after="100"/>
+      <w:spacing w:before="480" w:after="0"/>
       <w:outlineLvl w:val="0"/>
     </w:pPr>
     <w:rPr>
-      <w:rFonts w:asciiTheme="majorHAnsi" w:eastAsiaTheme="majorEastAsia" w:hAnsiTheme="majorHAnsi" w:cstheme="majorBidi" w:ascii="Noto Sans Thai" w:hAnsi="Noto Sans Thai" w:eastAsia="Noto Sans Thai" w:cs="Noto Sans Thai"/>
+      <w:rFonts w:asciiTheme="majorHAnsi" w:eastAsiaTheme="majorEastAsia" w:hAnsiTheme="majorHAnsi" w:cstheme="majorBidi"/>
       <w:b/>
       <w:bCs/>
-      <w:color w:val="173D36"/>
-      <w:sz w:val="32"/>
+      <w:color w:val="365F91" w:themeColor="accent1" w:themeShade="BF"/>
+      <w:sz w:val="28"/>
       <w:szCs w:val="28"/>
     </w:rPr>
   </w:style>
@@ -806,15 +1245,15 @@
     <w:pPr>
       <w:keepNext/>
       <w:keepLines/>
-      <w:spacing w:before="200" w:after="100"/>
+      <w:spacing w:before="200" w:after="0"/>
       <w:outlineLvl w:val="1"/>
     </w:pPr>
     <w:rPr>
-      <w:rFonts w:asciiTheme="majorHAnsi" w:eastAsiaTheme="majorEastAsia" w:hAnsiTheme="majorHAnsi" w:cstheme="majorBidi" w:ascii="Noto Sans Thai" w:hAnsi="Noto Sans Thai" w:eastAsia="Noto Sans Thai" w:cs="Noto Sans Thai"/>
+      <w:rFonts w:asciiTheme="majorHAnsi" w:eastAsiaTheme="majorEastAsia" w:hAnsiTheme="majorHAnsi" w:cstheme="majorBidi"/>
       <w:b/>
       <w:bCs/>
-      <w:color w:val="173D36"/>
-      <w:sz w:val="32"/>
+      <w:color w:val="4F81BD" w:themeColor="accent1"/>
+      <w:sz w:val="26"/>
       <w:szCs w:val="26"/>
     </w:rPr>
   </w:style>
@@ -830,15 +1269,14 @@
     <w:pPr>
       <w:keepNext/>
       <w:keepLines/>
-      <w:spacing w:before="200" w:after="100"/>
+      <w:spacing w:before="200" w:after="0"/>
       <w:outlineLvl w:val="2"/>
     </w:pPr>
     <w:rPr>
-      <w:rFonts w:asciiTheme="majorHAnsi" w:eastAsiaTheme="majorEastAsia" w:hAnsiTheme="majorHAnsi" w:cstheme="majorBidi" w:ascii="Noto Sans Thai" w:hAnsi="Noto Sans Thai" w:eastAsia="Noto Sans Thai" w:cs="Noto Sans Thai"/>
+      <w:rFonts w:asciiTheme="majorHAnsi" w:eastAsiaTheme="majorEastAsia" w:hAnsiTheme="majorHAnsi" w:cstheme="majorBidi"/>
       <w:b/>
       <w:bCs/>
-      <w:color w:val="173D36"/>
-      <w:sz w:val="32"/>
+      <w:color w:val="4F81BD" w:themeColor="accent1"/>
     </w:rPr>
   </w:style>
   <w:style w:type="paragraph" w:styleId="Heading4">
@@ -1072,15 +1510,15 @@
       <w:pBdr>
         <w:bottom w:val="single" w:sz="8" w:space="4" w:color="4F81BD" w:themeColor="accent1"/>
       </w:pBdr>
-      <w:spacing w:after="100" w:line="240" w:lineRule="auto"/>
+      <w:spacing w:after="300" w:line="240" w:lineRule="auto"/>
       <w:contextualSpacing/>
     </w:pPr>
     <w:rPr>
-      <w:rFonts w:asciiTheme="majorHAnsi" w:eastAsiaTheme="majorEastAsia" w:hAnsiTheme="majorHAnsi" w:cstheme="majorBidi" w:ascii="Noto Sans Thai" w:hAnsi="Noto Sans Thai" w:eastAsia="Noto Sans Thai" w:cs="Noto Sans Thai"/>
-      <w:color w:val="173D36"/>
+      <w:rFonts w:asciiTheme="majorHAnsi" w:eastAsiaTheme="majorEastAsia" w:hAnsiTheme="majorHAnsi" w:cstheme="majorBidi"/>
+      <w:color w:val="17365D" w:themeColor="text2" w:themeShade="BF"/>
       <w:spacing w:val="5"/>
       <w:kern w:val="28"/>
-      <w:sz w:val="40"/>
+      <w:sz w:val="52"/>
       <w:szCs w:val="52"/>
     </w:rPr>
   </w:style>
@@ -1254,14 +1692,8 @@
       <w:numPr>
         <w:numId w:val="1"/>
       </w:numPr>
-      <w:spacing w:after="100"/>
       <w:contextualSpacing/>
     </w:pPr>
-    <w:rPr>
-      <w:rFonts w:ascii="Noto Sans Thai" w:hAnsi="Noto Sans Thai" w:eastAsia="Noto Sans Thai" w:cs="Noto Sans Thai"/>
-      <w:color w:val="173D36"/>
-      <w:sz w:val="20"/>
-    </w:rPr>
   </w:style>
   <w:style w:type="paragraph" w:styleId="ListBullet2">
     <w:name w:val="List Bullet 2"/>
@@ -1299,14 +1731,8 @@
       <w:numPr>
         <w:numId w:val="5"/>
       </w:numPr>
-      <w:spacing w:after="100"/>
       <w:contextualSpacing/>
     </w:pPr>
-    <w:rPr>
-      <w:rFonts w:ascii="Noto Sans Thai" w:hAnsi="Noto Sans Thai" w:eastAsia="Noto Sans Thai" w:cs="Noto Sans Thai"/>
-      <w:color w:val="173D36"/>
-      <w:sz w:val="20"/>
-    </w:rPr>
   </w:style>
   <w:style w:type="paragraph" w:styleId="ListNumber2">
     <w:name w:val="List Number 2"/>
@@ -1527,13 +1953,12 @@
     <w:qFormat/>
     <w:rsid w:val="00FC693F"/>
     <w:pPr>
-      <w:spacing w:line="240" w:lineRule="auto" w:after="100"/>
+      <w:spacing w:line="240" w:lineRule="auto"/>
     </w:pPr>
     <w:rPr>
-      <w:rFonts w:ascii="Noto Sans Thai" w:hAnsi="Noto Sans Thai" w:eastAsia="Noto Sans Thai" w:cs="Noto Sans Thai"/>
       <w:b/>
       <w:bCs/>
-      <w:color w:val="173D36"/>
+      <w:color w:val="4F81BD" w:themeColor="accent1"/>
       <w:sz w:val="18"/>
       <w:szCs w:val="18"/>
     </w:rPr>

</xml_diff>